<commit_message>
Site Revised from feedback.
</commit_message>
<xml_diff>
--- a/public/Jacob_Bernard_Resume.docx
+++ b/public/Jacob_Bernard_Resume.docx
@@ -2,12 +2,357 @@
 <file path=word/document.xml><?xml version="1.0" encoding="utf-8"?>
 <w:document xmlns:wpc="http://schemas.microsoft.com/office/word/2010/wordprocessingCanvas" xmlns:mo="http://schemas.microsoft.com/office/mac/office/2008/main" xmlns:mc="http://schemas.openxmlformats.org/markup-compatibility/2006" xmlns:mv="urn:schemas-microsoft-com:mac:vml" xmlns:o="urn:schemas-microsoft-com:office:office" xmlns:r="http://schemas.openxmlformats.org/officeDocument/2006/relationships" xmlns:m="http://schemas.openxmlformats.org/officeDocument/2006/math" xmlns:v="urn:schemas-microsoft-com:vml" xmlns:wp14="http://schemas.microsoft.com/office/word/2010/wordprocessingDrawing" xmlns:wp="http://schemas.openxmlformats.org/drawingml/2006/wordprocessingDrawing" xmlns:w10="urn:schemas-microsoft-com:office:word" xmlns:w="http://schemas.openxmlformats.org/wordprocessingml/2006/main" xmlns:w14="http://schemas.microsoft.com/office/word/2010/wordml" xmlns:wpg="http://schemas.microsoft.com/office/word/2010/wordprocessingGroup" xmlns:wpi="http://schemas.microsoft.com/office/word/2010/wordprocessingInk" xmlns:wne="http://schemas.microsoft.com/office/word/2006/wordml" xmlns:wps="http://schemas.microsoft.com/office/word/2010/wordprocessingShape" mc:Ignorable="w14 wp14">
   <w:body>
+    <w:tbl>
+      <w:tblPr>
+        <w:tblW w:type="auto" w:w="0"/>
+        <w:tblLook w:firstColumn="1" w:firstRow="1" w:lastColumn="0" w:lastRow="0" w:noHBand="0" w:noVBand="1" w:val="04A0"/>
+      </w:tblPr>
+      <w:tblGrid>
+        <w:gridCol w:w="9072"/>
+        <w:gridCol w:w="1440"/>
+      </w:tblGrid>
+      <w:tr>
+        <w:tc>
+          <w:tcPr>
+            <w:tcW w:type="dxa" w:w="5256"/>
+          </w:tcPr>
+          <w:p>
+            <w:pPr>
+              <w:spacing w:after="80"/>
+            </w:pPr>
+            <w:r>
+              <w:rPr>
+                <w:b/>
+                <w:color w:val="18394A"/>
+                <w:sz w:val="48"/>
+              </w:rPr>
+              <w:t>JACOB BERNARD</w:t>
+            </w:r>
+          </w:p>
+          <w:p>
+            <w:r>
+              <w:rPr>
+                <w:b/>
+              </w:rPr>
+              <w:t>FRONTEND DEVELOPER | UI DESIGNER</w:t>
+            </w:r>
+          </w:p>
+          <w:p>
+            <w:r>
+              <w:rPr>
+                <w:sz w:val="17"/>
+              </w:rPr>
+              <w:t>github.com/jacobbernard68-ux | linkedin.com/in/jacobbernard159</w:t>
+            </w:r>
+          </w:p>
+        </w:tc>
+        <w:tc>
+          <w:tcPr>
+            <w:tcW w:type="dxa" w:w="5256"/>
+          </w:tcPr>
+          <w:p>
+            <w:r>
+              <w:drawing>
+                <wp:inline xmlns:a="http://schemas.openxmlformats.org/drawingml/2006/main" xmlns:pic="http://schemas.openxmlformats.org/drawingml/2006/picture">
+                  <wp:extent cx="694944" cy="694944"/>
+                  <wp:docPr id="1" name="Picture 1"/>
+                  <wp:cNvGraphicFramePr>
+                    <a:graphicFrameLocks noChangeAspect="1"/>
+                  </wp:cNvGraphicFramePr>
+                  <a:graphic>
+                    <a:graphicData uri="http://schemas.openxmlformats.org/drawingml/2006/picture">
+                      <pic:pic>
+                        <pic:nvPicPr>
+                          <pic:cNvPr id="0" name="image.png"/>
+                          <pic:cNvPicPr/>
+                        </pic:nvPicPr>
+                        <pic:blipFill>
+                          <a:blip r:embed="rId9"/>
+                          <a:stretch>
+                            <a:fillRect/>
+                          </a:stretch>
+                        </pic:blipFill>
+                        <pic:spPr>
+                          <a:xfrm>
+                            <a:off x="0" y="0"/>
+                            <a:ext cx="694944" cy="694944"/>
+                          </a:xfrm>
+                          <a:prstGeom prst="rect"/>
+                        </pic:spPr>
+                      </pic:pic>
+                    </a:graphicData>
+                  </a:graphic>
+                </wp:inline>
+              </w:drawing>
+            </w:r>
+          </w:p>
+        </w:tc>
+      </w:tr>
+    </w:tbl>
     <w:p>
       <w:pPr>
-        <w:pStyle w:val="Title"/>
+        <w:pStyle w:val="Heading1"/>
       </w:pPr>
       <w:r>
-        <w:t>Jacob Bernard</w:t>
+        <w:t>PROFESSIONAL SUMMARY</w:t>
+      </w:r>
+    </w:p>
+    <w:p>
+      <w:r>
+        <w:t>Frontend Developer and UI Designer with 16 years of enterprise IT experience and a passion for building responsive, user-focused web applications. Skilled in HTML, CSS, JavaScript, React, and Figma, with practical coursework in Node.js, Express, REST APIs, MySQL, and MongoDB that supports data-aware interface development. I create modern interfaces that emphasize usability, accessibility, and maintainable code while combining technical problem-solving with thoughtful design.</w:t>
+      </w:r>
+    </w:p>
+    <w:p>
+      <w:pPr>
+        <w:pStyle w:val="Heading1"/>
+      </w:pPr>
+      <w:r>
+        <w:t>TECHNICAL SKILLS</w:t>
+      </w:r>
+    </w:p>
+    <w:tbl>
+      <w:tblPr>
+        <w:tblW w:type="auto" w:w="0"/>
+        <w:tblLook w:firstColumn="1" w:firstRow="1" w:lastColumn="0" w:lastRow="0" w:noHBand="0" w:noVBand="1" w:val="04A0"/>
+      </w:tblPr>
+      <w:tblGrid>
+        <w:gridCol w:w="2628"/>
+        <w:gridCol w:w="2628"/>
+        <w:gridCol w:w="2628"/>
+        <w:gridCol w:w="2628"/>
+      </w:tblGrid>
+      <w:tr>
+        <w:tc>
+          <w:tcPr>
+            <w:tcW w:type="dxa" w:w="2628"/>
+            <w:shd w:fill="EAF0F2"/>
+          </w:tcPr>
+          <w:p>
+            <w:pPr>
+              <w:jc w:val="center"/>
+            </w:pPr>
+            <w:r>
+              <w:rPr>
+                <w:b/>
+                <w:sz w:val="16"/>
+              </w:rPr>
+              <w:t>React</w:t>
+            </w:r>
+          </w:p>
+        </w:tc>
+        <w:tc>
+          <w:tcPr>
+            <w:tcW w:type="dxa" w:w="2628"/>
+            <w:shd w:fill="EAF0F2"/>
+          </w:tcPr>
+          <w:p>
+            <w:pPr>
+              <w:jc w:val="center"/>
+            </w:pPr>
+            <w:r>
+              <w:rPr>
+                <w:b/>
+                <w:sz w:val="16"/>
+              </w:rPr>
+              <w:t>JavaScript ES6+</w:t>
+            </w:r>
+          </w:p>
+        </w:tc>
+        <w:tc>
+          <w:tcPr>
+            <w:tcW w:type="dxa" w:w="2628"/>
+            <w:shd w:fill="EAF0F2"/>
+          </w:tcPr>
+          <w:p>
+            <w:pPr>
+              <w:jc w:val="center"/>
+            </w:pPr>
+            <w:r>
+              <w:rPr>
+                <w:b/>
+                <w:sz w:val="16"/>
+              </w:rPr>
+              <w:t>HTML5</w:t>
+            </w:r>
+          </w:p>
+        </w:tc>
+        <w:tc>
+          <w:tcPr>
+            <w:tcW w:type="dxa" w:w="2628"/>
+            <w:shd w:fill="EAF0F2"/>
+          </w:tcPr>
+          <w:p>
+            <w:pPr>
+              <w:jc w:val="center"/>
+            </w:pPr>
+            <w:r>
+              <w:rPr>
+                <w:b/>
+                <w:sz w:val="16"/>
+              </w:rPr>
+              <w:t>CSS3</w:t>
+            </w:r>
+          </w:p>
+        </w:tc>
+      </w:tr>
+      <w:tr>
+        <w:tc>
+          <w:tcPr>
+            <w:tcW w:type="dxa" w:w="2628"/>
+            <w:shd w:fill="EAF0F2"/>
+          </w:tcPr>
+          <w:p>
+            <w:pPr>
+              <w:jc w:val="center"/>
+            </w:pPr>
+            <w:r>
+              <w:rPr>
+                <w:b/>
+                <w:sz w:val="16"/>
+              </w:rPr>
+              <w:t>Figma</w:t>
+            </w:r>
+          </w:p>
+        </w:tc>
+        <w:tc>
+          <w:tcPr>
+            <w:tcW w:type="dxa" w:w="2628"/>
+            <w:shd w:fill="EAF0F2"/>
+          </w:tcPr>
+          <w:p>
+            <w:pPr>
+              <w:jc w:val="center"/>
+            </w:pPr>
+            <w:r>
+              <w:rPr>
+                <w:b/>
+                <w:sz w:val="16"/>
+              </w:rPr>
+              <w:t>Responsive Design</w:t>
+            </w:r>
+          </w:p>
+        </w:tc>
+        <w:tc>
+          <w:tcPr>
+            <w:tcW w:type="dxa" w:w="2628"/>
+            <w:shd w:fill="EAF0F2"/>
+          </w:tcPr>
+          <w:p>
+            <w:pPr>
+              <w:jc w:val="center"/>
+            </w:pPr>
+            <w:r>
+              <w:rPr>
+                <w:b/>
+                <w:sz w:val="16"/>
+              </w:rPr>
+              <w:t>Accessibility / WCAG</w:t>
+            </w:r>
+          </w:p>
+        </w:tc>
+        <w:tc>
+          <w:tcPr>
+            <w:tcW w:type="dxa" w:w="2628"/>
+            <w:shd w:fill="EAF0F2"/>
+          </w:tcPr>
+          <w:p>
+            <w:pPr>
+              <w:jc w:val="center"/>
+            </w:pPr>
+            <w:r>
+              <w:rPr>
+                <w:b/>
+                <w:sz w:val="16"/>
+              </w:rPr>
+              <w:t>Context API</w:t>
+            </w:r>
+          </w:p>
+        </w:tc>
+      </w:tr>
+      <w:tr>
+        <w:tc>
+          <w:tcPr>
+            <w:tcW w:type="dxa" w:w="2628"/>
+            <w:shd w:fill="EAF0F2"/>
+          </w:tcPr>
+          <w:p>
+            <w:pPr>
+              <w:jc w:val="center"/>
+            </w:pPr>
+            <w:r>
+              <w:rPr>
+                <w:b/>
+                <w:sz w:val="16"/>
+              </w:rPr>
+              <w:t>Git / GitHub</w:t>
+            </w:r>
+          </w:p>
+        </w:tc>
+        <w:tc>
+          <w:tcPr>
+            <w:tcW w:type="dxa" w:w="2628"/>
+            <w:shd w:fill="EAF0F2"/>
+          </w:tcPr>
+          <w:p>
+            <w:pPr>
+              <w:jc w:val="center"/>
+            </w:pPr>
+            <w:r>
+              <w:rPr>
+                <w:b/>
+                <w:sz w:val="16"/>
+              </w:rPr>
+              <w:t>Node.js / Express</w:t>
+            </w:r>
+          </w:p>
+        </w:tc>
+        <w:tc>
+          <w:tcPr>
+            <w:tcW w:type="dxa" w:w="2628"/>
+            <w:shd w:fill="EAF0F2"/>
+          </w:tcPr>
+          <w:p>
+            <w:pPr>
+              <w:jc w:val="center"/>
+            </w:pPr>
+            <w:r>
+              <w:rPr>
+                <w:b/>
+                <w:sz w:val="16"/>
+              </w:rPr>
+              <w:t>MySQL / SQL</w:t>
+            </w:r>
+          </w:p>
+        </w:tc>
+        <w:tc>
+          <w:tcPr>
+            <w:tcW w:type="dxa" w:w="2628"/>
+            <w:shd w:fill="EAF0F2"/>
+          </w:tcPr>
+          <w:p>
+            <w:pPr>
+              <w:jc w:val="center"/>
+            </w:pPr>
+            <w:r>
+              <w:rPr>
+                <w:b/>
+                <w:sz w:val="16"/>
+              </w:rPr>
+              <w:t>MongoDB</w:t>
+            </w:r>
+          </w:p>
+        </w:tc>
+      </w:tr>
+    </w:tbl>
+    <w:p>
+      <w:r>
+        <w:rPr>
+          <w:b/>
+        </w:rPr>
+        <w:t xml:space="preserve">Frontend: </w:t>
+      </w:r>
+      <w:r>
+        <w:t>HTML5, CSS3, JavaScript (ES6+), React, JSX, responsive web design, component-based architecture, Context API, state management, DOM manipulation, and Fetch API.</w:t>
       </w:r>
     </w:p>
     <w:p>
@@ -15,13 +360,43 @@
         <w:rPr>
           <w:b/>
         </w:rPr>
-        <w:t>Frontend Developer | UI Designer</w:t>
-        <w:br/>
+        <w:t xml:space="preserve">UI / UX: </w:t>
       </w:r>
       <w:r>
-        <w:t>Designing intuitive interfaces backed by enterprise-level technical experience.</w:t>
-        <w:br/>
-        <w:br/>
+        <w:t>Figma, wireframing, typography, visual hierarchy, accessibility (WCAG), and information architecture.</w:t>
+      </w:r>
+    </w:p>
+    <w:p>
+      <w:r>
+        <w:rPr>
+          <w:b/>
+        </w:rPr>
+        <w:t xml:space="preserve">Backend &amp; data: </w:t>
+      </w:r>
+      <w:r>
+        <w:t>Node.js, Express, REST APIs, MySQL, SQL, relational database design, CRUD operations, JOINs, aggregate queries, transactions, MongoDB document data, and authentication fundamentals.</w:t>
+      </w:r>
+    </w:p>
+    <w:p>
+      <w:r>
+        <w:rPr>
+          <w:b/>
+        </w:rPr>
+        <w:t xml:space="preserve">Tools: </w:t>
+      </w:r>
+      <w:r>
+        <w:t>Git, GitHub, VS Code, and Chrome DevTools.</w:t>
+      </w:r>
+    </w:p>
+    <w:p>
+      <w:r>
+        <w:rPr>
+          <w:b/>
+        </w:rPr>
+        <w:t xml:space="preserve">Additional: </w:t>
+      </w:r>
+      <w:r>
+        <w:t>Linux, Python, enterprise IT, technical troubleshooting, and process improvement.</w:t>
       </w:r>
     </w:p>
     <w:p>
@@ -29,12 +404,165 @@
         <w:pStyle w:val="Heading1"/>
       </w:pPr>
       <w:r>
-        <w:t>Professional Summary</w:t>
+        <w:t>PROJECTS</w:t>
+      </w:r>
+    </w:p>
+    <w:p>
+      <w:pPr>
+        <w:pStyle w:val="Heading2"/>
+      </w:pPr>
+      <w:r>
+        <w:t>The Bean’s Place</w:t>
+      </w:r>
+    </w:p>
+    <w:p>
+      <w:pPr>
+        <w:keepNext/>
+      </w:pPr>
+      <w:r>
+        <w:rPr>
+          <w:i/>
+          <w:sz w:val="18"/>
+        </w:rPr>
+        <w:t>React</w:t>
+      </w:r>
+    </w:p>
+    <w:p>
+      <w:pPr>
+        <w:pStyle w:val="ListBullet"/>
+        <w:spacing w:after="80"/>
+      </w:pPr>
+      <w:r>
+        <w:t>Responsive coffee shop application featuring reusable components, Context API shopping-cart state, interactive UI, and modern React practices.</w:t>
+      </w:r>
+    </w:p>
+    <w:p>
+      <w:pPr>
+        <w:pStyle w:val="Heading2"/>
+      </w:pPr>
+      <w:r>
+        <w:t>The Classic Cut</w:t>
+      </w:r>
+    </w:p>
+    <w:p>
+      <w:pPr>
+        <w:keepNext/>
+      </w:pPr>
+      <w:r>
+        <w:rPr>
+          <w:i/>
+          <w:sz w:val="18"/>
+        </w:rPr>
+        <w:t>HTML · CSS · JavaScript</w:t>
+      </w:r>
+    </w:p>
+    <w:p>
+      <w:pPr>
+        <w:pStyle w:val="ListBullet"/>
+        <w:spacing w:after="80"/>
+      </w:pPr>
+      <w:r>
+        <w:t>Modern barbershop website demonstrating responsive layouts, DOM manipulation, event-driven interaction, semantic HTML, CSS Grid, Flexbox, and a mobile-first approach.</w:t>
+      </w:r>
+    </w:p>
+    <w:p>
+      <w:pPr>
+        <w:pStyle w:val="Heading2"/>
+      </w:pPr>
+      <w:r>
+        <w:t>Personal Portfolio</w:t>
+      </w:r>
+    </w:p>
+    <w:p>
+      <w:pPr>
+        <w:keepNext/>
+      </w:pPr>
+      <w:r>
+        <w:rPr>
+          <w:i/>
+          <w:sz w:val="18"/>
+        </w:rPr>
+        <w:t>React</w:t>
+      </w:r>
+    </w:p>
+    <w:p>
+      <w:pPr>
+        <w:pStyle w:val="ListBullet"/>
+        <w:spacing w:after="80"/>
+      </w:pPr>
+      <w:r>
+        <w:t>A responsive portfolio showcasing frontend projects, UI case studies, and technical experience through a consistent design system.</w:t>
+      </w:r>
+    </w:p>
+    <w:p>
+      <w:pPr>
+        <w:pStyle w:val="Heading2"/>
+      </w:pPr>
+      <w:r>
+        <w:t>Backend &amp; Data Systems</w:t>
+      </w:r>
+    </w:p>
+    <w:p>
+      <w:pPr>
+        <w:keepNext/>
+      </w:pPr>
+      <w:r>
+        <w:rPr>
+          <w:i/>
+          <w:sz w:val="18"/>
+        </w:rPr>
+        <w:t>React · Express · MySQL · MongoDB</w:t>
+      </w:r>
+    </w:p>
+    <w:p>
+      <w:pPr>
+        <w:pStyle w:val="ListBullet"/>
+        <w:spacing w:after="80"/>
+      </w:pPr>
+      <w:r>
+        <w:t>A consolidated coursework case study tracing progression from a MySQL-connected student portal to hybrid-data and authenticated commerce applications.</w:t>
+      </w:r>
+    </w:p>
+    <w:p>
+      <w:pPr>
+        <w:pStyle w:val="Heading2"/>
+      </w:pPr>
+      <w:r>
+        <w:t>UI Design Concept</w:t>
+      </w:r>
+    </w:p>
+    <w:p>
+      <w:pPr>
+        <w:keepNext/>
+      </w:pPr>
+      <w:r>
+        <w:rPr>
+          <w:i/>
+          <w:sz w:val="18"/>
+        </w:rPr>
+        <w:t>Figma</w:t>
+      </w:r>
+    </w:p>
+    <w:p>
+      <w:pPr>
+        <w:pStyle w:val="ListBullet"/>
+        <w:spacing w:after="80"/>
+      </w:pPr>
+      <w:r>
+        <w:t>A complete website interface emphasizing typography, layout systems, visual hierarchy, and responsive user experience.</w:t>
       </w:r>
     </w:p>
     <w:p>
       <w:r>
-        <w:t>Frontend Developer and UI Designer with 16 years of enterprise IT experience and a passion for building responsive, user-focused web applications. Skilled in HTML, CSS, JavaScript, React, and Figma, with experience creating modern interfaces that emphasize usability, accessibility, and maintainable code. Bringing a foundation in mission-critical systems and internal web platform development, I combine technical problem-solving with thoughtful design to create intuitive digital experiences while continually expanding my frontend development skills through hands-on projects.</w:t>
+        <w:br w:type="page"/>
+      </w:r>
+    </w:p>
+    <w:p>
+      <w:pPr>
+        <w:pStyle w:val="Subtitle"/>
+      </w:pPr>
+      <w:r>
+        <w:t>JACOB BERNARD | EXPERIENCE &amp; DEVELOPMENT</w:t>
       </w:r>
     </w:p>
     <w:p>
@@ -42,21 +570,152 @@
         <w:pStyle w:val="Heading1"/>
       </w:pPr>
       <w:r>
-        <w:t>Technical Skills</w:t>
+        <w:t>EXPERIENCE</w:t>
       </w:r>
     </w:p>
     <w:p>
+      <w:pPr>
+        <w:pStyle w:val="Heading2"/>
+      </w:pPr>
       <w:r>
-        <w:t>Frontend: HTML5, CSS3, JavaScript (ES6+), React, JSX, Responsive Web Design, Component-Based Architecture, Context API, State Management, DOM Manipulation, Fetch API</w:t>
-        <w:br/>
-        <w:br/>
-        <w:t>UI/UX: Figma, Wireframing, Typography, Visual Hierarchy, Accessibility (WCAG), Information Architecture</w:t>
-        <w:br/>
-        <w:br/>
-        <w:t>Tools: Git, GitHub, VS Code, Chrome DevTools</w:t>
-        <w:br/>
-        <w:br/>
-        <w:t>Additional: Linux, Python, Enterprise IT, Technical Troubleshooting, Process Improvement</w:t>
+        <w:t>Defense Intelligence Agency</w:t>
+      </w:r>
+    </w:p>
+    <w:p>
+      <w:pPr>
+        <w:keepNext/>
+      </w:pPr>
+      <w:r>
+        <w:rPr>
+          <w:i/>
+          <w:sz w:val="18"/>
+        </w:rPr>
+        <w:t>Data Systems &amp; IT Operations Manager · May 2021–July 2026</w:t>
+      </w:r>
+    </w:p>
+    <w:p>
+      <w:pPr>
+        <w:pStyle w:val="ListBullet"/>
+        <w:spacing w:after="80"/>
+      </w:pPr>
+      <w:r>
+        <w:t>Supported high-availability enterprise systems, improved workflows, managed hardware lifecycle processes, and translated complex technical issues across multidisciplinary teams.</w:t>
+      </w:r>
+    </w:p>
+    <w:p>
+      <w:pPr>
+        <w:pStyle w:val="Heading2"/>
+      </w:pPr>
+      <w:r>
+        <w:t>1st Information Operations Battalion</w:t>
+      </w:r>
+    </w:p>
+    <w:p>
+      <w:pPr>
+        <w:keepNext/>
+      </w:pPr>
+      <w:r>
+        <w:rPr>
+          <w:i/>
+          <w:sz w:val="18"/>
+        </w:rPr>
+        <w:t>Senior IT Specialist · Oct 2018–May 2021</w:t>
+      </w:r>
+    </w:p>
+    <w:p>
+      <w:pPr>
+        <w:pStyle w:val="ListBullet"/>
+        <w:spacing w:after="80"/>
+      </w:pPr>
+      <w:r>
+        <w:t>Supported Linux-based operational systems, created Python automation, coordinated maintenance, and maintained platform reliability.</w:t>
+      </w:r>
+    </w:p>
+    <w:p>
+      <w:pPr>
+        <w:pStyle w:val="Heading2"/>
+      </w:pPr>
+      <w:r>
+        <w:t>21st Theater Sustainment Command</w:t>
+      </w:r>
+    </w:p>
+    <w:p>
+      <w:pPr>
+        <w:keepNext/>
+      </w:pPr>
+      <w:r>
+        <w:rPr>
+          <w:i/>
+          <w:sz w:val="18"/>
+        </w:rPr>
+        <w:t>IT Specialist, Web Platforms · Aug 2015–Oct 2018</w:t>
+      </w:r>
+    </w:p>
+    <w:p>
+      <w:pPr>
+        <w:pStyle w:val="ListBullet"/>
+        <w:spacing w:after="80"/>
+      </w:pPr>
+      <w:r>
+        <w:t>Developed internal web platforms, improved navigation and information architecture, and created interface improvements adopted at higher organizational levels.</w:t>
+      </w:r>
+    </w:p>
+    <w:p>
+      <w:pPr>
+        <w:pStyle w:val="Heading2"/>
+      </w:pPr>
+      <w:r>
+        <w:t>51st Expeditionary Signal Battalion</w:t>
+      </w:r>
+    </w:p>
+    <w:p>
+      <w:pPr>
+        <w:keepNext/>
+      </w:pPr>
+      <w:r>
+        <w:rPr>
+          <w:i/>
+          <w:sz w:val="18"/>
+        </w:rPr>
+        <w:t>Information Technology Specialist · Mar 2013–Aug 2015</w:t>
+      </w:r>
+    </w:p>
+    <w:p>
+      <w:pPr>
+        <w:pStyle w:val="ListBullet"/>
+        <w:spacing w:after="80"/>
+      </w:pPr>
+      <w:r>
+        <w:t>Developed internal websites, strengthened organizational communication, and supported enterprise IT infrastructure.</w:t>
+      </w:r>
+    </w:p>
+    <w:p>
+      <w:pPr>
+        <w:pStyle w:val="Heading2"/>
+      </w:pPr>
+      <w:r>
+        <w:t>716th Military Police Battalion</w:t>
+      </w:r>
+    </w:p>
+    <w:p>
+      <w:pPr>
+        <w:keepNext/>
+      </w:pPr>
+      <w:r>
+        <w:rPr>
+          <w:i/>
+          <w:sz w:val="18"/>
+        </w:rPr>
+        <w:t>IT Support Technician · Mar 2011–Mar 2013</w:t>
+      </w:r>
+    </w:p>
+    <w:p>
+      <w:pPr>
+        <w:pStyle w:val="ListBullet"/>
+        <w:spacing w:after="80"/>
+      </w:pPr>
+      <w:r>
+        <w:t>Provided end-user support, maintained hardware and software, and resolved technical issues.</w:t>
       </w:r>
     </w:p>
     <w:p>
@@ -64,7 +723,59 @@
         <w:pStyle w:val="Heading1"/>
       </w:pPr>
       <w:r>
-        <w:t>Projects</w:t>
+        <w:t>TECHNICAL TRAINING</w:t>
+      </w:r>
+    </w:p>
+    <w:p>
+      <w:r>
+        <w:rPr>
+          <w:b/>
+        </w:rPr>
+        <w:t xml:space="preserve">HTML &amp; CSS: </w:t>
+      </w:r>
+      <w:r>
+        <w:t>Semantic HTML, responsive design, Flexbox, CSS Grid, accessibility, forms, and animations.</w:t>
+      </w:r>
+    </w:p>
+    <w:p>
+      <w:r>
+        <w:rPr>
+          <w:b/>
+        </w:rPr>
+        <w:t xml:space="preserve">JavaScript: </w:t>
+      </w:r>
+      <w:r>
+        <w:t>ES6+, DOM manipulation, event handling, Fetch API, asynchronous programming, objects, and arrays.</w:t>
+      </w:r>
+    </w:p>
+    <w:p>
+      <w:r>
+        <w:rPr>
+          <w:b/>
+        </w:rPr>
+        <w:t xml:space="preserve">React: </w:t>
+      </w:r>
+      <w:r>
+        <w:t>Components, JSX, props, state, hooks, Context API, routing, and component composition.</w:t>
+      </w:r>
+    </w:p>
+    <w:p>
+      <w:r>
+        <w:rPr>
+          <w:b/>
+        </w:rPr>
+        <w:t xml:space="preserve">Backend &amp; data systems: </w:t>
+      </w:r>
+      <w:r>
+        <w:t>Node.js and Express REST APIs connected to MySQL and MongoDB, including relational schema design, CRUD operations, JOINs, aggregation, transactions, document data, and authentication concepts.</w:t>
+      </w:r>
+    </w:p>
+    <w:p>
+      <w:pPr>
+        <w:pStyle w:val="Heading1"/>
+      </w:pPr>
+      <w:r>
+        <w:t>CORE STRENGTHS</w:t>
       </w:r>
     </w:p>
     <w:p>
@@ -72,51 +783,12 @@
         <w:pStyle w:val="Heading2"/>
       </w:pPr>
       <w:r>
-        <w:t>The Bean's Place (React)</w:t>
+        <w:t>How I work</w:t>
       </w:r>
     </w:p>
     <w:p>
       <w:r>
-        <w:t>Designed and developed a responsive coffee shop application demonstrating reusable component architecture, Context API state management, and responsive interface design. Highlights: reusable React components, shopping cart state management, responsive layouts, interactive UI, modern React practices.</w:t>
-      </w:r>
-    </w:p>
-    <w:p>
-      <w:pPr>
-        <w:pStyle w:val="Heading2"/>
-      </w:pPr>
-      <w:r>
-        <w:t>The Classic Cut (HTML/CSS/JavaScript)</w:t>
-      </w:r>
-    </w:p>
-    <w:p>
-      <w:r>
-        <w:t>Designed and developed a modern barbershop website to strengthen frontend development skills through responsive layouts and interactive JavaScript functionality. Highlights: responsive design, DOM manipulation, event-driven programming, semantic HTML, CSS Grid &amp; Flexbox, mobile-first approach.</w:t>
-      </w:r>
-    </w:p>
-    <w:p>
-      <w:pPr>
-        <w:pStyle w:val="Heading2"/>
-      </w:pPr>
-      <w:r>
-        <w:t>Personal Portfolio (React)</w:t>
-      </w:r>
-    </w:p>
-    <w:p>
-      <w:r>
-        <w:t>Building a responsive portfolio showcasing frontend projects, UI case studies, and technical experience through a consistent design system.</w:t>
-      </w:r>
-    </w:p>
-    <w:p>
-      <w:pPr>
-        <w:pStyle w:val="Heading2"/>
-      </w:pPr>
-      <w:r>
-        <w:t>UI Design Concept (Figma)</w:t>
-      </w:r>
-    </w:p>
-    <w:p>
-      <w:r>
-        <w:t>Designed a complete website interface emphasizing typography, layout systems, visual hierarchy, and responsive user experience.</w:t>
+        <w:t>Frontend development, UI design, problem solving, technical communication, cross-functional collaboration, continuous learning, and attention to detail. My approach brings structure to complexity and keeps the user’s path clear.</w:t>
       </w:r>
     </w:p>
     <w:p>
@@ -124,134 +796,218 @@
         <w:pStyle w:val="Heading1"/>
       </w:pPr>
       <w:r>
-        <w:t>Professional Experience</w:t>
+        <w:t>PROFESSIONAL BADGES</w:t>
       </w:r>
     </w:p>
-    <w:p>
-      <w:pPr>
-        <w:pStyle w:val="Heading2"/>
-      </w:pPr>
-      <w:r>
-        <w:t>Defense Intelligence Agency – Data Systems &amp; IT Operations Manager</w:t>
-      </w:r>
-    </w:p>
-    <w:p>
-      <w:r>
-        <w:t>May 2021 – July 16, 2026</w:t>
-      </w:r>
-    </w:p>
-    <w:p>
-      <w:r>
-        <w:t>Supported enterprise systems requiring high availability and operational continuity. Collaborated across multidisciplinary teams, improved workflows, simplified complex technical issues, optimized hardware lifecycle processes, and applied analytical problem-solving in mission-critical environments.</w:t>
-      </w:r>
-    </w:p>
-    <w:p>
-      <w:pPr>
-        <w:pStyle w:val="Heading2"/>
-      </w:pPr>
-      <w:r>
-        <w:t>1st Information Operations Battalion – Senior IT Specialist</w:t>
-      </w:r>
-    </w:p>
-    <w:p>
-      <w:r>
-        <w:t>Oct 2018 – May 2021</w:t>
-      </w:r>
-    </w:p>
-    <w:p>
-      <w:r>
-        <w:t>Supported Linux-based operational systems, developed Python automation scripts, maintained platform reliability, and coordinated system maintenance.</w:t>
-      </w:r>
-    </w:p>
-    <w:p>
-      <w:pPr>
-        <w:pStyle w:val="Heading2"/>
-      </w:pPr>
-      <w:r>
-        <w:t>21st Theater Sustainment Command – Information Technology Specialist (Web Platforms)</w:t>
-      </w:r>
-    </w:p>
-    <w:p>
-      <w:r>
-        <w:t>Aug 2015 – Oct 2018</w:t>
-      </w:r>
-    </w:p>
-    <w:p>
-      <w:r>
-        <w:t>Developed and maintained command-level internal web platforms, improved navigation and information architecture, customized HTML templates, and created interface improvements adopted by higher organizational levels.</w:t>
-      </w:r>
-    </w:p>
-    <w:p>
-      <w:pPr>
-        <w:pStyle w:val="Heading2"/>
-      </w:pPr>
-      <w:r>
-        <w:t>51st Expeditionary Signal Battalion – Information Technology Specialist</w:t>
-      </w:r>
-    </w:p>
-    <w:p>
-      <w:r>
-        <w:t>Mar 2013 – Aug 2015</w:t>
-      </w:r>
-    </w:p>
-    <w:p>
-      <w:r>
-        <w:t>Developed internal websites, improved organizational communication, and supported enterprise IT infrastructure.</w:t>
-      </w:r>
-    </w:p>
-    <w:p>
-      <w:pPr>
-        <w:pStyle w:val="Heading2"/>
-      </w:pPr>
-      <w:r>
-        <w:t>716th Military Police Battalion – IT Support Technician</w:t>
-      </w:r>
-    </w:p>
-    <w:p>
-      <w:r>
-        <w:t>Mar 2011 – Mar 2013</w:t>
-      </w:r>
-    </w:p>
-    <w:p>
-      <w:r>
-        <w:t>Provided end-user technical support, installed and maintained hardware/software, and resolved technical issues.</w:t>
-      </w:r>
-    </w:p>
-    <w:p>
-      <w:pPr>
-        <w:pStyle w:val="Heading1"/>
-      </w:pPr>
-      <w:r>
-        <w:t>Technical Training</w:t>
-      </w:r>
-    </w:p>
-    <w:p>
-      <w:r>
-        <w:t>HTML &amp; CSS: Semantic HTML, Responsive Design, Flexbox, CSS Grid, Accessibility, Forms, Animations</w:t>
-        <w:br/>
-        <w:br/>
-        <w:t>JavaScript: ES6+, DOM Manipulation, Event Handling, Fetch API, Async Programming, Objects &amp; Arrays</w:t>
-        <w:br/>
-        <w:br/>
-        <w:t>React: Components, JSX, Props, State, Hooks, Context API, Routing, Component Composition</w:t>
-      </w:r>
-    </w:p>
-    <w:p>
-      <w:pPr>
-        <w:pStyle w:val="Heading1"/>
-      </w:pPr>
-      <w:r>
-        <w:t>Core Strengths</w:t>
-      </w:r>
-    </w:p>
-    <w:p>
-      <w:r>
-        <w:t>Frontend Development • UI Design • Problem Solving • Technical Communication • Cross-Functional Collaboration • Continuous Learning • Attention to Detail</w:t>
-      </w:r>
-    </w:p>
+    <w:tbl>
+      <w:tblPr>
+        <w:tblW w:type="auto" w:w="0"/>
+        <w:tblLook w:firstColumn="1" w:firstRow="1" w:lastColumn="0" w:lastRow="0" w:noHBand="0" w:noVBand="1" w:val="04A0"/>
+      </w:tblPr>
+      <w:tblGrid>
+        <w:gridCol w:w="5256"/>
+        <w:gridCol w:w="5256"/>
+      </w:tblGrid>
+      <w:tr>
+        <w:tc>
+          <w:tcPr>
+            <w:tcW w:type="dxa" w:w="5256"/>
+            <w:shd w:fill="F3F6F7"/>
+          </w:tcPr>
+          <w:p>
+            <w:r>
+              <w:drawing>
+                <wp:inline xmlns:a="http://schemas.openxmlformats.org/drawingml/2006/main" xmlns:pic="http://schemas.openxmlformats.org/drawingml/2006/picture">
+                  <wp:extent cx="502920" cy="502920"/>
+                  <wp:docPr id="2" name="Picture 2"/>
+                  <wp:cNvGraphicFramePr>
+                    <a:graphicFrameLocks noChangeAspect="1"/>
+                  </wp:cNvGraphicFramePr>
+                  <a:graphic>
+                    <a:graphicData uri="http://schemas.openxmlformats.org/drawingml/2006/picture">
+                      <pic:pic>
+                        <pic:nvPicPr>
+                          <pic:cNvPr id="0" name="html-css.png"/>
+                          <pic:cNvPicPr/>
+                        </pic:nvPicPr>
+                        <pic:blipFill>
+                          <a:blip r:embed="rId10"/>
+                          <a:stretch>
+                            <a:fillRect/>
+                          </a:stretch>
+                        </pic:blipFill>
+                        <pic:spPr>
+                          <a:xfrm>
+                            <a:off x="0" y="0"/>
+                            <a:ext cx="502920" cy="502920"/>
+                          </a:xfrm>
+                          <a:prstGeom prst="rect"/>
+                        </pic:spPr>
+                      </pic:pic>
+                    </a:graphicData>
+                  </a:graphic>
+                </wp:inline>
+              </w:drawing>
+            </w:r>
+            <w:r>
+              <w:rPr>
+                <w:sz w:val="17"/>
+              </w:rPr>
+              <w:t xml:space="preserve">  HTML and CSS Web Designer</w:t>
+            </w:r>
+          </w:p>
+        </w:tc>
+        <w:tc>
+          <w:tcPr>
+            <w:tcW w:type="dxa" w:w="5256"/>
+            <w:shd w:fill="F3F6F7"/>
+          </w:tcPr>
+          <w:p>
+            <w:r>
+              <w:drawing>
+                <wp:inline xmlns:a="http://schemas.openxmlformats.org/drawingml/2006/main" xmlns:pic="http://schemas.openxmlformats.org/drawingml/2006/picture">
+                  <wp:extent cx="502920" cy="502920"/>
+                  <wp:docPr id="3" name="Picture 3"/>
+                  <wp:cNvGraphicFramePr>
+                    <a:graphicFrameLocks noChangeAspect="1"/>
+                  </wp:cNvGraphicFramePr>
+                  <a:graphic>
+                    <a:graphicData uri="http://schemas.openxmlformats.org/drawingml/2006/picture">
+                      <pic:pic>
+                        <pic:nvPicPr>
+                          <pic:cNvPr id="0" name="javascript.png"/>
+                          <pic:cNvPicPr/>
+                        </pic:nvPicPr>
+                        <pic:blipFill>
+                          <a:blip r:embed="rId11"/>
+                          <a:stretch>
+                            <a:fillRect/>
+                          </a:stretch>
+                        </pic:blipFill>
+                        <pic:spPr>
+                          <a:xfrm>
+                            <a:off x="0" y="0"/>
+                            <a:ext cx="502920" cy="502920"/>
+                          </a:xfrm>
+                          <a:prstGeom prst="rect"/>
+                        </pic:spPr>
+                      </pic:pic>
+                    </a:graphicData>
+                  </a:graphic>
+                </wp:inline>
+              </w:drawing>
+            </w:r>
+            <w:r>
+              <w:rPr>
+                <w:sz w:val="17"/>
+              </w:rPr>
+              <w:t xml:space="preserve">  JavaScript Professional Developer</w:t>
+            </w:r>
+          </w:p>
+        </w:tc>
+      </w:tr>
+      <w:tr>
+        <w:tc>
+          <w:tcPr>
+            <w:tcW w:type="dxa" w:w="5256"/>
+            <w:shd w:fill="F3F6F7"/>
+          </w:tcPr>
+          <w:p>
+            <w:r>
+              <w:drawing>
+                <wp:inline xmlns:a="http://schemas.openxmlformats.org/drawingml/2006/main" xmlns:pic="http://schemas.openxmlformats.org/drawingml/2006/picture">
+                  <wp:extent cx="502920" cy="502920"/>
+                  <wp:docPr id="4" name="Picture 4"/>
+                  <wp:cNvGraphicFramePr>
+                    <a:graphicFrameLocks noChangeAspect="1"/>
+                  </wp:cNvGraphicFramePr>
+                  <a:graphic>
+                    <a:graphicData uri="http://schemas.openxmlformats.org/drawingml/2006/picture">
+                      <pic:pic>
+                        <pic:nvPicPr>
+                          <pic:cNvPr id="0" name="react-js.png"/>
+                          <pic:cNvPicPr/>
+                        </pic:nvPicPr>
+                        <pic:blipFill>
+                          <a:blip r:embed="rId12"/>
+                          <a:stretch>
+                            <a:fillRect/>
+                          </a:stretch>
+                        </pic:blipFill>
+                        <pic:spPr>
+                          <a:xfrm>
+                            <a:off x="0" y="0"/>
+                            <a:ext cx="502920" cy="502920"/>
+                          </a:xfrm>
+                          <a:prstGeom prst="rect"/>
+                        </pic:spPr>
+                      </pic:pic>
+                    </a:graphicData>
+                  </a:graphic>
+                </wp:inline>
+              </w:drawing>
+            </w:r>
+            <w:r>
+              <w:rPr>
+                <w:sz w:val="17"/>
+              </w:rPr>
+              <w:t xml:space="preserve">  ReactJS Framework Developer</w:t>
+            </w:r>
+          </w:p>
+        </w:tc>
+        <w:tc>
+          <w:tcPr>
+            <w:tcW w:type="dxa" w:w="5256"/>
+            <w:shd w:fill="F3F6F7"/>
+          </w:tcPr>
+          <w:p>
+            <w:r>
+              <w:drawing>
+                <wp:inline xmlns:a="http://schemas.openxmlformats.org/drawingml/2006/main" xmlns:pic="http://schemas.openxmlformats.org/drawingml/2006/picture">
+                  <wp:extent cx="502920" cy="502920"/>
+                  <wp:docPr id="5" name="Picture 5"/>
+                  <wp:cNvGraphicFramePr>
+                    <a:graphicFrameLocks noChangeAspect="1"/>
+                  </wp:cNvGraphicFramePr>
+                  <a:graphic>
+                    <a:graphicData uri="http://schemas.openxmlformats.org/drawingml/2006/picture">
+                      <pic:pic>
+                        <pic:nvPicPr>
+                          <pic:cNvPr id="0" name="mysql.png"/>
+                          <pic:cNvPicPr/>
+                        </pic:nvPicPr>
+                        <pic:blipFill>
+                          <a:blip r:embed="rId13"/>
+                          <a:stretch>
+                            <a:fillRect/>
+                          </a:stretch>
+                        </pic:blipFill>
+                        <pic:spPr>
+                          <a:xfrm>
+                            <a:off x="0" y="0"/>
+                            <a:ext cx="502920" cy="502920"/>
+                          </a:xfrm>
+                          <a:prstGeom prst="rect"/>
+                        </pic:spPr>
+                      </pic:pic>
+                    </a:graphicData>
+                  </a:graphic>
+                </wp:inline>
+              </w:drawing>
+            </w:r>
+            <w:r>
+              <w:rPr>
+                <w:sz w:val="17"/>
+              </w:rPr>
+              <w:t xml:space="preserve">  MySQL Backend Developer</w:t>
+            </w:r>
+          </w:p>
+        </w:tc>
+      </w:tr>
+    </w:tbl>
     <w:sectPr>
       <w:pgSz w:w="12240" w:h="15840"/>
-      <w:pgMar w:top="1440" w:right="1800" w:bottom="1440" w:left="1800" w:header="720" w:footer="720" w:gutter="0"/>
+      <w:pgMar w:top="720" w:right="864" w:bottom="720" w:left="864" w:header="720" w:footer="720" w:gutter="0"/>
       <w:cols w:space="720"/>
       <w:docGrid w:linePitch="360"/>
     </w:sectPr>
@@ -622,8 +1378,12 @@
     <w:name w:val="Normal"/>
     <w:qFormat/>
     <w:rsid w:val="00FC693F"/>
+    <w:pPr>
+      <w:spacing w:after="80" w:line="252" w:lineRule="auto"/>
+    </w:pPr>
     <w:rPr>
-      <w:sz w:val="22"/>
+      <w:rFonts w:ascii="Arial" w:hAnsi="Arial"/>
+      <w:sz w:val="19"/>
     </w:rPr>
   </w:style>
   <w:style w:type="paragraph" w:styleId="Header">
@@ -681,15 +1441,18 @@
     <w:pPr>
       <w:keepNext/>
       <w:keepLines/>
-      <w:spacing w:before="480" w:after="0"/>
+      <w:spacing w:before="160" w:after="60"/>
       <w:outlineLvl w:val="0"/>
+      <w:pBdr>
+        <w:bottom w:val="single" w:sz="6" w:color="B8CADC" w:space="2"/>
+      </w:pBdr>
     </w:pPr>
     <w:rPr>
-      <w:rFonts w:asciiTheme="majorHAnsi" w:eastAsiaTheme="majorEastAsia" w:hAnsiTheme="majorHAnsi" w:cstheme="majorBidi"/>
+      <w:rFonts w:asciiTheme="majorHAnsi" w:eastAsiaTheme="majorEastAsia" w:hAnsiTheme="majorHAnsi" w:cstheme="majorBidi" w:ascii="Arial" w:hAnsi="Arial"/>
       <w:b/>
       <w:bCs/>
-      <w:color w:val="365F91" w:themeColor="accent1" w:themeShade="BF"/>
-      <w:sz w:val="28"/>
+      <w:color w:val="18394A"/>
+      <w:sz w:val="22"/>
       <w:szCs w:val="28"/>
     </w:rPr>
   </w:style>
@@ -705,15 +1468,15 @@
     <w:pPr>
       <w:keepNext/>
       <w:keepLines/>
-      <w:spacing w:before="200" w:after="0"/>
+      <w:spacing w:before="100" w:after="0"/>
       <w:outlineLvl w:val="1"/>
     </w:pPr>
     <w:rPr>
-      <w:rFonts w:asciiTheme="majorHAnsi" w:eastAsiaTheme="majorEastAsia" w:hAnsiTheme="majorHAnsi" w:cstheme="majorBidi"/>
+      <w:rFonts w:asciiTheme="majorHAnsi" w:eastAsiaTheme="majorEastAsia" w:hAnsiTheme="majorHAnsi" w:cstheme="majorBidi" w:ascii="Arial" w:hAnsi="Arial"/>
       <w:b/>
       <w:bCs/>
-      <w:color w:val="4F81BD" w:themeColor="accent1"/>
-      <w:sz w:val="26"/>
+      <w:color w:val="18394A"/>
+      <w:sz w:val="20"/>
       <w:szCs w:val="26"/>
     </w:rPr>
   </w:style>
@@ -974,8 +1737,8 @@
       <w:contextualSpacing/>
     </w:pPr>
     <w:rPr>
-      <w:rFonts w:asciiTheme="majorHAnsi" w:eastAsiaTheme="majorEastAsia" w:hAnsiTheme="majorHAnsi" w:cstheme="majorBidi"/>
-      <w:color w:val="17365D" w:themeColor="text2" w:themeShade="BF"/>
+      <w:rFonts w:asciiTheme="majorHAnsi" w:eastAsiaTheme="majorEastAsia" w:hAnsiTheme="majorHAnsi" w:cstheme="majorBidi" w:ascii="Arial" w:hAnsi="Arial"/>
+      <w:color w:val="18394A"/>
       <w:spacing w:val="5"/>
       <w:kern w:val="28"/>
       <w:sz w:val="52"/>
@@ -1011,10 +1774,10 @@
       </w:numPr>
     </w:pPr>
     <w:rPr>
-      <w:rFonts w:asciiTheme="majorHAnsi" w:eastAsiaTheme="majorEastAsia" w:hAnsiTheme="majorHAnsi" w:cstheme="majorBidi"/>
+      <w:rFonts w:asciiTheme="majorHAnsi" w:eastAsiaTheme="majorEastAsia" w:hAnsiTheme="majorHAnsi" w:cstheme="majorBidi" w:ascii="Arial" w:hAnsi="Arial"/>
       <w:i/>
       <w:iCs/>
-      <w:color w:val="4F81BD" w:themeColor="accent1"/>
+      <w:color w:val="18394A"/>
       <w:spacing w:val="15"/>
       <w:sz w:val="24"/>
       <w:szCs w:val="24"/>

</xml_diff>